<commit_message>
fix(manuel): corrige styles heading dupliques et TOC non peuplee au chargement
</commit_message>
<xml_diff>
--- a/manuel_collegue_excel.docx
+++ b/manuel_collegue_excel.docx
@@ -4950,10 +4950,17 @@
     <w:basedOn w:val="Normal"/>
     <w:next w:val="Normal"/>
     <w:qFormat/>
+    <w:pPr>
+      <w:spacing w:after="240" w:before="240"/>
+      <w:outlineLvl w:val="0"/>
+    </w:pPr>
     <w:rPr>
-      <w:color w:val="2E74B5"/>
-      <w:sz w:val="32"/>
-      <w:szCs w:val="32"/>
+      <w:rFonts w:ascii="Calibri" w:cs="Calibri" w:eastAsia="Calibri" w:hAnsi="Calibri"/>
+      <w:b/>
+      <w:bCs/>
+      <w:color w:val="1F3864"/>
+      <w:sz w:val="40"/>
+      <w:szCs w:val="40"/>
     </w:rPr>
   </w:style>
   <w:style w:type="paragraph" w:styleId="Heading2">
@@ -4961,10 +4968,20 @@
     <w:basedOn w:val="Normal"/>
     <w:next w:val="Normal"/>
     <w:qFormat/>
+    <w:pPr>
+      <w:pBdr>
+        <w:bottom w:val="single" w:color="2E5C8A" w:sz="6" w:space="4"/>
+      </w:pBdr>
+      <w:spacing w:after="200" w:before="320"/>
+      <w:outlineLvl w:val="1"/>
+    </w:pPr>
     <w:rPr>
-      <w:color w:val="2E74B5"/>
-      <w:sz w:val="26"/>
-      <w:szCs w:val="26"/>
+      <w:rFonts w:ascii="Calibri" w:cs="Calibri" w:eastAsia="Calibri" w:hAnsi="Calibri"/>
+      <w:b/>
+      <w:bCs/>
+      <w:color w:val="2E5C8A"/>
+      <w:sz w:val="30"/>
+      <w:szCs w:val="30"/>
     </w:rPr>
   </w:style>
   <w:style w:type="paragraph" w:styleId="Heading3">
@@ -4972,8 +4989,15 @@
     <w:basedOn w:val="Normal"/>
     <w:next w:val="Normal"/>
     <w:qFormat/>
+    <w:pPr>
+      <w:spacing w:after="100" w:before="200"/>
+      <w:outlineLvl w:val="2"/>
+    </w:pPr>
     <w:rPr>
-      <w:color w:val="1F4D78"/>
+      <w:rFonts w:ascii="Calibri" w:cs="Calibri" w:eastAsia="Calibri" w:hAnsi="Calibri"/>
+      <w:b/>
+      <w:bCs/>
+      <w:color w:val="1F3864"/>
       <w:sz w:val="24"/>
       <w:szCs w:val="24"/>
     </w:rPr>
@@ -5106,62 +5130,5 @@
       <w:szCs w:val="20"/>
     </w:rPr>
   </w:style>
-  <w:style w:type="paragraph" w:styleId="Heading1">
-    <w:name w:val="Heading 1"/>
-    <w:basedOn w:val="Normal"/>
-    <w:next w:val="Normal"/>
-    <w:qFormat/>
-    <w:pPr>
-      <w:spacing w:after="240" w:before="240"/>
-      <w:outlineLvl w:val="0"/>
-    </w:pPr>
-    <w:rPr>
-      <w:rFonts w:ascii="Calibri" w:cs="Calibri" w:eastAsia="Calibri" w:hAnsi="Calibri"/>
-      <w:b/>
-      <w:bCs/>
-      <w:color w:val="1F3864"/>
-      <w:sz w:val="40"/>
-      <w:szCs w:val="40"/>
-    </w:rPr>
-  </w:style>
-  <w:style w:type="paragraph" w:styleId="Heading2">
-    <w:name w:val="Heading 2"/>
-    <w:basedOn w:val="Normal"/>
-    <w:next w:val="Normal"/>
-    <w:qFormat/>
-    <w:pPr>
-      <w:pBdr>
-        <w:bottom w:val="single" w:color="2E5C8A" w:sz="6" w:space="4"/>
-      </w:pBdr>
-      <w:spacing w:after="200" w:before="320"/>
-      <w:outlineLvl w:val="1"/>
-    </w:pPr>
-    <w:rPr>
-      <w:rFonts w:ascii="Calibri" w:cs="Calibri" w:eastAsia="Calibri" w:hAnsi="Calibri"/>
-      <w:b/>
-      <w:bCs/>
-      <w:color w:val="2E5C8A"/>
-      <w:sz w:val="30"/>
-      <w:szCs w:val="30"/>
-    </w:rPr>
-  </w:style>
-  <w:style w:type="paragraph" w:styleId="Heading3">
-    <w:name w:val="Heading 3"/>
-    <w:basedOn w:val="Normal"/>
-    <w:next w:val="Normal"/>
-    <w:qFormat/>
-    <w:pPr>
-      <w:spacing w:after="100" w:before="200"/>
-      <w:outlineLvl w:val="2"/>
-    </w:pPr>
-    <w:rPr>
-      <w:rFonts w:ascii="Calibri" w:cs="Calibri" w:eastAsia="Calibri" w:hAnsi="Calibri"/>
-      <w:b/>
-      <w:bCs/>
-      <w:color w:val="1F3864"/>
-      <w:sz w:val="24"/>
-      <w:szCs w:val="24"/>
-    </w:rPr>
-  </w:style>
 </w:styles>
 </file>
</xml_diff>

<commit_message>
docs(manuel): ajoute FAQ pytest/commande non reconnue (probleme PATH Windows)
Ajoute une entree dans la section Depannage : quand pip installe en mode
utilisateur (site-packages non inscriptible), le dossier Scripts n'est pas
toujours dans le PATH Windows, rendant pytest introuvable meme installe.
Solution : python -m pytest a la place de pytest seul.

Trouve en conditions reelles (JLC bloque sur un second PC), confirme par
python -m pytest fonctionnel.
</commit_message>
<xml_diff>
--- a/manuel_collegue_excel.docx
+++ b/manuel_collegue_excel.docx
@@ -4339,6 +4339,163 @@
         <w:rPr>
           <w:rFonts w:ascii="Calibri" w:cs="Calibri" w:eastAsia="Calibri" w:hAnsi="Calibri"/>
         </w:rPr>
+        <w:t xml:space="preserve">"</w:t>
+      </w:r>
+      <w:r>
+        <w:rPr>
+          <w:rFonts w:ascii="Consolas" w:cs="Consolas" w:eastAsia="Consolas" w:hAnsi="Consolas"/>
+          <w:sz w:val="20"/>
+          <w:szCs w:val="20"/>
+          <w:shd w:fill="EDEDED" w:val="clear"/>
+        </w:rPr>
+        <w:t xml:space="preserve">pytest</w:t>
+      </w:r>
+      <w:r>
+        <w:rPr>
+          <w:rFonts w:ascii="Calibri" w:cs="Calibri" w:eastAsia="Calibri" w:hAnsi="Calibri"/>
+        </w:rPr>
+        <w:t xml:space="preserve"> (ou une autre commande) n'est pas reconnu"</w:t>
+      </w:r>
+    </w:p>
+    <w:p>
+      <w:pPr>
+        <w:spacing w:after="120" w:line="276"/>
+      </w:pPr>
+      <w:r>
+        <w:rPr>
+          <w:rFonts w:ascii="Calibri" w:cs="Calibri" w:eastAsia="Calibri" w:hAnsi="Calibri"/>
+        </w:rPr>
+        <w:t xml:space="preserve">Ça arrive souvent sous Windows quand tu n'as pas les droits administrateur :</w:t>
+      </w:r>
+    </w:p>
+    <w:p>
+      <w:pPr>
+        <w:spacing w:after="120" w:line="276"/>
+      </w:pPr>
+      <w:r>
+        <w:rPr>
+          <w:rFonts w:ascii="Calibri" w:cs="Calibri" w:eastAsia="Calibri" w:hAnsi="Calibri"/>
+        </w:rPr>
+        <w:t xml:space="preserve">l'installation se fait quand même, mais dans un dossier que Windows ne</w:t>
+      </w:r>
+    </w:p>
+    <w:p>
+      <w:pPr>
+        <w:spacing w:after="120" w:line="276"/>
+      </w:pPr>
+      <w:r>
+        <w:rPr>
+          <w:rFonts w:ascii="Calibri" w:cs="Calibri" w:eastAsia="Calibri" w:hAnsi="Calibri"/>
+        </w:rPr>
+        <w:t xml:space="preserve">trouve pas automatiquement. Solution simple : au lieu de taper </w:t>
+      </w:r>
+      <w:r>
+        <w:rPr>
+          <w:rFonts w:ascii="Consolas" w:cs="Consolas" w:eastAsia="Consolas" w:hAnsi="Consolas"/>
+          <w:sz w:val="20"/>
+          <w:szCs w:val="20"/>
+          <w:shd w:fill="EDEDED" w:val="clear"/>
+        </w:rPr>
+        <w:t xml:space="preserve">pytest</w:t>
+      </w:r>
+    </w:p>
+    <w:p>
+      <w:pPr>
+        <w:spacing w:after="120" w:line="276"/>
+      </w:pPr>
+      <w:r>
+        <w:rPr>
+          <w:rFonts w:ascii="Calibri" w:cs="Calibri" w:eastAsia="Calibri" w:hAnsi="Calibri"/>
+        </w:rPr>
+        <w:t xml:space="preserve">tout seul, tape </w:t>
+      </w:r>
+      <w:r>
+        <w:rPr>
+          <w:rFonts w:ascii="Consolas" w:cs="Consolas" w:eastAsia="Consolas" w:hAnsi="Consolas"/>
+          <w:sz w:val="20"/>
+          <w:szCs w:val="20"/>
+          <w:shd w:fill="EDEDED" w:val="clear"/>
+        </w:rPr>
+        <w:t xml:space="preserve">python -m pytest</w:t>
+      </w:r>
+      <w:r>
+        <w:rPr>
+          <w:rFonts w:ascii="Calibri" w:cs="Calibri" w:eastAsia="Calibri" w:hAnsi="Calibri"/>
+        </w:rPr>
+        <w:t xml:space="preserve"> (ça marche aussi pour les autres</w:t>
+      </w:r>
+    </w:p>
+    <w:p>
+      <w:pPr>
+        <w:spacing w:after="120" w:line="276"/>
+      </w:pPr>
+      <w:r>
+        <w:rPr>
+          <w:rFonts w:ascii="Calibri" w:cs="Calibri" w:eastAsia="Calibri" w:hAnsi="Calibri"/>
+        </w:rPr>
+        <w:t xml:space="preserve">commandes, par exemple </w:t>
+      </w:r>
+      <w:r>
+        <w:rPr>
+          <w:rFonts w:ascii="Consolas" w:cs="Consolas" w:eastAsia="Consolas" w:hAnsi="Consolas"/>
+          <w:sz w:val="20"/>
+          <w:szCs w:val="20"/>
+          <w:shd w:fill="EDEDED" w:val="clear"/>
+        </w:rPr>
+        <w:t xml:space="preserve">python -m pip install ...</w:t>
+      </w:r>
+      <w:r>
+        <w:rPr>
+          <w:rFonts w:ascii="Calibri" w:cs="Calibri" w:eastAsia="Calibri" w:hAnsi="Calibri"/>
+        </w:rPr>
+        <w:t xml:space="preserve">). Si ça affiche bien un</w:t>
+      </w:r>
+    </w:p>
+    <w:p>
+      <w:pPr>
+        <w:spacing w:after="120" w:line="276"/>
+      </w:pPr>
+      <w:r>
+        <w:rPr>
+          <w:rFonts w:ascii="Calibri" w:cs="Calibri" w:eastAsia="Calibri" w:hAnsi="Calibri"/>
+        </w:rPr>
+        <w:t xml:space="preserve">résultat, tu peux utiliser </w:t>
+      </w:r>
+      <w:r>
+        <w:rPr>
+          <w:rFonts w:ascii="Consolas" w:cs="Consolas" w:eastAsia="Consolas" w:hAnsi="Consolas"/>
+          <w:sz w:val="20"/>
+          <w:szCs w:val="20"/>
+          <w:shd w:fill="EDEDED" w:val="clear"/>
+        </w:rPr>
+        <w:t xml:space="preserve">python -m</w:t>
+      </w:r>
+      <w:r>
+        <w:rPr>
+          <w:rFonts w:ascii="Calibri" w:cs="Calibri" w:eastAsia="Calibri" w:hAnsi="Calibri"/>
+        </w:rPr>
+        <w:t xml:space="preserve"> devant chaque commande de ce genre</w:t>
+      </w:r>
+    </w:p>
+    <w:p>
+      <w:pPr>
+        <w:spacing w:after="120" w:line="276"/>
+      </w:pPr>
+      <w:r>
+        <w:rPr>
+          <w:rFonts w:ascii="Calibri" w:cs="Calibri" w:eastAsia="Calibri" w:hAnsi="Calibri"/>
+        </w:rPr>
+        <w:t xml:space="preserve">dans tout le reste de ce manuel.</w:t>
+      </w:r>
+    </w:p>
+    <w:p>
+      <w:pPr>
+        <w:pStyle w:val="Heading3"/>
+      </w:pPr>
+      <w:r>
+        <w:rPr>
+          <w:rFonts w:ascii="Calibri" w:cs="Calibri" w:eastAsia="Calibri" w:hAnsi="Calibri"/>
+        </w:rPr>
         <w:t xml:space="preserve">"Je ne sais pas quoi copier-coller, je suis perdue"</w:t>
       </w:r>
     </w:p>

</xml_diff>